<commit_message>
Add manuscript validation modules and update main logic
Introduces new modules for abstracts, cover page, descriptors, conclusion, tables/figures, references, and PDF export. Refactors main.py to use these modules and expands the validation pipeline. Updates TODO.md with more detailed checklist and revises README.md usage instructions. Adds new resource files and updates CLI to include XML path handling.
</commit_message>
<xml_diff>
--- a/resources/Teste2.docx
+++ b/resources/Teste2.docx
@@ -9,12 +9,14 @@
           <w:lang w:val="pt-BR"/>
         </w:rPr>
       </w:pPr>
+      <w:proofErr w:type="spellStart"/>
       <w:r>
         <w:rPr>
           <w:lang w:val="pt-BR"/>
         </w:rPr>
         <w:t>Aaaaa</w:t>
       </w:r>
+      <w:proofErr w:type="spellEnd"/>
       <w:r>
         <w:rPr>
           <w:lang w:val="pt-BR"/>
@@ -142,12 +144,14 @@
                 <w:lang w:val="pt-BR"/>
               </w:rPr>
             </w:pPr>
+            <w:proofErr w:type="spellStart"/>
             <w:r>
               <w:rPr>
                 <w:lang w:val="pt-BR"/>
               </w:rPr>
               <w:t>tgdg</w:t>
             </w:r>
+            <w:proofErr w:type="spellEnd"/>
           </w:p>
         </w:tc>
       </w:tr>
@@ -194,6 +198,7 @@
           </w:tcPr>
           <w:p>
             <w:pPr>
+              <w:keepNext/>
               <w:rPr>
                 <w:lang w:val="pt-BR"/>
               </w:rPr>
@@ -210,6 +215,54 @@
     </w:tbl>
     <w:p>
       <w:pPr>
+        <w:pStyle w:val="Legenda"/>
+        <w:rPr>
+          <w:lang w:val="pt-BR"/>
+        </w:rPr>
+      </w:pPr>
+      <w:r>
+        <w:rPr>
+          <w:lang w:val="pt-BR"/>
+        </w:rPr>
+        <w:t xml:space="preserve">Tabela </w:t>
+      </w:r>
+      <w:r>
+        <w:fldChar w:fldCharType="begin"/>
+      </w:r>
+      <w:r>
+        <w:rPr>
+          <w:lang w:val="pt-BR"/>
+        </w:rPr>
+        <w:instrText xml:space="preserve"> SEQ Tabela \* ARABIC </w:instrText>
+      </w:r>
+      <w:r>
+        <w:fldChar w:fldCharType="separate"/>
+      </w:r>
+      <w:r>
+        <w:rPr>
+          <w:noProof/>
+          <w:lang w:val="pt-BR"/>
+        </w:rPr>
+        <w:t>1</w:t>
+      </w:r>
+      <w:r>
+        <w:fldChar w:fldCharType="end"/>
+      </w:r>
+      <w:r>
+        <w:rPr>
+          <w:lang w:val="pt-BR"/>
+        </w:rPr>
+        <w:t xml:space="preserve"> – esse é o t</w:t>
+      </w:r>
+      <w:r>
+        <w:rPr>
+          <w:lang w:val="pt-BR"/>
+        </w:rPr>
+        <w:t>ítulo da tabela</w:t>
+      </w:r>
+    </w:p>
+    <w:p>
+      <w:pPr>
         <w:rPr>
           <w:u w:val="single"/>
           <w:lang w:val="pt-BR"/>
@@ -234,6 +287,7 @@
     <w:p>
       <w:pPr>
         <w:rPr>
+          <w:u w:val="single"/>
           <w:lang w:val="pt-BR"/>
         </w:rPr>
       </w:pPr>
@@ -248,20 +302,100 @@
     <w:p>
       <w:pPr>
         <w:rPr>
-          <w:u w:val="single"/>
           <w:lang w:val="pt-BR"/>
         </w:rPr>
       </w:pPr>
-      <w:r>
-        <w:rPr>
-          <w:u w:val="single"/>
-          <w:lang w:val="pt-BR"/>
-        </w:rPr>
-        <w:t>c</w:t>
-      </w:r>
     </w:p>
     <w:p>
       <w:pPr>
+        <w:pStyle w:val="Legenda"/>
+        <w:keepNext/>
+        <w:rPr>
+          <w:rFonts w:ascii="Times New Roman" w:hAnsi="Times New Roman" w:cs="Times New Roman"/>
+          <w:sz w:val="20"/>
+          <w:szCs w:val="20"/>
+        </w:rPr>
+      </w:pPr>
+      <w:proofErr w:type="spellStart"/>
+      <w:r>
+        <w:rPr>
+          <w:rFonts w:ascii="Times New Roman" w:hAnsi="Times New Roman" w:cs="Times New Roman"/>
+          <w:sz w:val="20"/>
+          <w:szCs w:val="20"/>
+        </w:rPr>
+        <w:t>Figura</w:t>
+      </w:r>
+      <w:proofErr w:type="spellEnd"/>
+      <w:r>
+        <w:rPr>
+          <w:rFonts w:ascii="Times New Roman" w:hAnsi="Times New Roman" w:cs="Times New Roman"/>
+          <w:sz w:val="20"/>
+          <w:szCs w:val="20"/>
+        </w:rPr>
+        <w:t xml:space="preserve"> </w:t>
+      </w:r>
+      <w:r>
+        <w:rPr>
+          <w:rFonts w:ascii="Times New Roman" w:hAnsi="Times New Roman" w:cs="Times New Roman"/>
+          <w:sz w:val="20"/>
+          <w:szCs w:val="20"/>
+        </w:rPr>
+        <w:fldChar w:fldCharType="begin"/>
+      </w:r>
+      <w:r>
+        <w:rPr>
+          <w:rFonts w:ascii="Times New Roman" w:hAnsi="Times New Roman" w:cs="Times New Roman"/>
+          <w:sz w:val="20"/>
+          <w:szCs w:val="20"/>
+        </w:rPr>
+        <w:instrText xml:space="preserve"> SEQ Figura \* ARABIC </w:instrText>
+      </w:r>
+      <w:r>
+        <w:rPr>
+          <w:rFonts w:ascii="Times New Roman" w:hAnsi="Times New Roman" w:cs="Times New Roman"/>
+          <w:sz w:val="20"/>
+          <w:szCs w:val="20"/>
+        </w:rPr>
+        <w:fldChar w:fldCharType="separate"/>
+      </w:r>
+      <w:r>
+        <w:rPr>
+          <w:rFonts w:ascii="Times New Roman" w:hAnsi="Times New Roman" w:cs="Times New Roman"/>
+          <w:noProof/>
+          <w:sz w:val="20"/>
+          <w:szCs w:val="20"/>
+        </w:rPr>
+        <w:t>1</w:t>
+      </w:r>
+      <w:r>
+        <w:rPr>
+          <w:rFonts w:ascii="Times New Roman" w:hAnsi="Times New Roman" w:cs="Times New Roman"/>
+          <w:sz w:val="20"/>
+          <w:szCs w:val="20"/>
+        </w:rPr>
+        <w:fldChar w:fldCharType="end"/>
+      </w:r>
+      <w:r>
+        <w:rPr>
+          <w:rFonts w:ascii="Times New Roman" w:hAnsi="Times New Roman" w:cs="Times New Roman"/>
+          <w:sz w:val="20"/>
+          <w:szCs w:val="20"/>
+        </w:rPr>
+        <w:t xml:space="preserve">- </w:t>
+      </w:r>
+      <w:proofErr w:type="spellStart"/>
+      <w:r>
+        <w:rPr>
+          <w:rFonts w:ascii="Times New Roman" w:hAnsi="Times New Roman" w:cs="Times New Roman"/>
+          <w:sz w:val="20"/>
+          <w:szCs w:val="20"/>
+        </w:rPr>
+        <w:t>blablabla</w:t>
+      </w:r>
+      <w:proofErr w:type="spellEnd"/>
+    </w:p>
+    <w:p>
+      <w:pPr>
         <w:rPr>
           <w:u w:val="single"/>
           <w:lang w:val="pt-BR"/>
@@ -269,9 +403,76 @@
       </w:pPr>
       <w:r>
         <w:rPr>
+          <w:u w:val="single"/>
+          <w:lang w:val="pt-BR"/>
+        </w:rPr>
+        <w:drawing>
+          <wp:inline distT="0" distB="0" distL="0" distR="0" wp14:anchorId="33374C65" wp14:editId="079AA9A6">
+            <wp:extent cx="5943600" cy="3158490"/>
+            <wp:effectExtent l="0" t="0" r="0" b="3810"/>
+            <wp:docPr id="1273734678" name="Imagem 1" descr="Tela de computador com fundo preto&#10;&#10;O conteúdo gerado por IA pode estar incorreto."/>
+            <wp:cNvGraphicFramePr>
+              <a:graphicFrameLocks xmlns:a="http://schemas.openxmlformats.org/drawingml/2006/main" noChangeAspect="1"/>
+            </wp:cNvGraphicFramePr>
+            <a:graphic xmlns:a="http://schemas.openxmlformats.org/drawingml/2006/main">
+              <a:graphicData uri="http://schemas.openxmlformats.org/drawingml/2006/picture">
+                <pic:pic xmlns:pic="http://schemas.openxmlformats.org/drawingml/2006/picture">
+                  <pic:nvPicPr>
+                    <pic:cNvPr id="1273734678" name="Imagem 1" descr="Tela de computador com fundo preto&#10;&#10;O conteúdo gerado por IA pode estar incorreto."/>
+                    <pic:cNvPicPr/>
+                  </pic:nvPicPr>
+                  <pic:blipFill>
+                    <a:blip r:embed="rId4"/>
+                    <a:stretch>
+                      <a:fillRect/>
+                    </a:stretch>
+                  </pic:blipFill>
+                  <pic:spPr>
+                    <a:xfrm>
+                      <a:off x="0" y="0"/>
+                      <a:ext cx="5943600" cy="3158490"/>
+                    </a:xfrm>
+                    <a:prstGeom prst="rect">
+                      <a:avLst/>
+                    </a:prstGeom>
+                  </pic:spPr>
+                </pic:pic>
+              </a:graphicData>
+            </a:graphic>
+          </wp:inline>
+        </w:drawing>
+      </w:r>
+    </w:p>
+    <w:p>
+      <w:pPr>
+        <w:tabs>
+          <w:tab w:val="left" w:pos="5174"/>
+        </w:tabs>
+        <w:jc w:val="center"/>
+        <w:rPr>
+          <w:lang w:val="pt-BR"/>
+        </w:rPr>
+      </w:pPr>
+      <w:r>
+        <w:rPr>
+          <w:lang w:val="pt-BR"/>
+        </w:rPr>
+        <w:t>(autor, 2025)</w:t>
+      </w:r>
+    </w:p>
+    <w:p>
+      <w:pPr>
+        <w:rPr>
+          <w:u w:val="single"/>
+          <w:lang w:val="pt-BR"/>
+        </w:rPr>
+      </w:pPr>
+      <w:r>
+        <w:rPr>
           <w:noProof/>
           <w:lang w:val="pt-BR"/>
         </w:rPr>
+        <w:lastRenderedPageBreak/>
         <w:drawing>
           <wp:inline distT="0" distB="0" distL="0" distR="0" wp14:anchorId="5CD55842" wp14:editId="680FBAB3">
             <wp:extent cx="5943600" cy="3935730"/>
@@ -288,7 +489,7 @@
                     <pic:cNvPicPr/>
                   </pic:nvPicPr>
                   <pic:blipFill>
-                    <a:blip r:embed="rId4"/>
+                    <a:blip r:embed="rId5"/>
                     <a:stretch>
                       <a:fillRect/>
                     </a:stretch>
@@ -392,6 +593,7 @@
           <w:u w:val="single"/>
           <w:lang w:val="pt-BR"/>
         </w:rPr>
+        <w:lastRenderedPageBreak/>
         <w:drawing>
           <wp:inline distT="0" distB="0" distL="0" distR="0" wp14:anchorId="7BAD1D05" wp14:editId="155948FF">
             <wp:extent cx="5943600" cy="3935730"/>
@@ -408,7 +610,7 @@
                     <pic:cNvPicPr/>
                   </pic:nvPicPr>
                   <pic:blipFill>
-                    <a:blip r:embed="rId4"/>
+                    <a:blip r:embed="rId5"/>
                     <a:stretch>
                       <a:fillRect/>
                     </a:stretch>
@@ -1375,6 +1577,25 @@
       </w:tblBorders>
     </w:tblPr>
   </w:style>
+  <w:style w:type="paragraph" w:styleId="Legenda">
+    <w:name w:val="caption"/>
+    <w:basedOn w:val="Normal"/>
+    <w:next w:val="Normal"/>
+    <w:uiPriority w:val="35"/>
+    <w:unhideWhenUsed/>
+    <w:qFormat/>
+    <w:rsid w:val="00D54870"/>
+    <w:pPr>
+      <w:spacing w:after="200" w:line="240" w:lineRule="auto"/>
+    </w:pPr>
+    <w:rPr>
+      <w:i/>
+      <w:iCs/>
+      <w:color w:val="0E2841" w:themeColor="text2"/>
+      <w:sz w:val="18"/>
+      <w:szCs w:val="18"/>
+    </w:rPr>
+  </w:style>
 </w:styles>
 </file>
 

</xml_diff>